<commit_message>
Điều chỉnh slide theo đánh giá phản biện; demo chạy trước, chỉ trình chiếu
- Demo chạy trước, trình chiếu video – ảnh; mô hình 3D mở được không cần Internet (plotly.min.js cục bộ)
- Giảm chữ Slide 3, 7, 12, 20; chi tiết chuyển sang TAI-LIEU-PHAT-TAY.md
- Thảo luận 15′; mục Chuẩn bị trước buổi thuyết trình; Phụ lục E câu hỏi thường gặp

Co-Authored-By: Claude Opus 5.5 <noreply@anthropic.com>
Claude-Session: https://claude.ai/code/session_01JoSsghLRHTtvcNzYXbKpzE
</commit_message>
<xml_diff>
--- a/thuyet-trinh/DANH-GIA-REVIEWER.docx
+++ b/thuyet-trinh/DANH-GIA-REVIEWER.docx
@@ -9,6 +9,151 @@
       </w:pPr>
       <w:r>
         <w:t xml:space="preserve">ĐÁNH GIÁ BÀI THUYẾT TRÌNH – GÓC NHÌN NGƯỜI PHẢN BIỆN</w:t>
+      </w:r>
+    </w:p>
+    <w:p>
+      <w:pPr>
+        <w:pStyle w:val="BlockText"/>
+      </w:pPr>
+      <w:r>
+        <w:rPr>
+          <w:bCs/>
+          <w:b/>
+        </w:rPr>
+        <w:t xml:space="preserve">Trạng thái xử lý (21/10/2026):</w:t>
+      </w:r>
+      <w:r>
+        <w:t xml:space="preserve"> </w:t>
+      </w:r>
+      <w:r>
+        <w:t xml:space="preserve">- ✅ Demo: chạy trước, chỉ trình chiếu video – ảnh (Slide 8, 13, 14, 15, 16, 19); mô hình 3D mở được không cần Internet.</w:t>
+      </w:r>
+      <w:r>
+        <w:t xml:space="preserve"> </w:t>
+      </w:r>
+      <w:r>
+        <w:t xml:space="preserve">- ✅ Giảm chữ: Slide 3 (bỏ bảng chatbot – Agent, bảng tính năng còn 4 dòng), Slide 7 (mô hình 1 dòng, tính năng còn 5), Slide 12 (bỏ bảng 8 tài liệu), Slide 20 (3 số lớn) – chi tiết chuyển sang</w:t>
+      </w:r>
+      <w:r>
+        <w:t xml:space="preserve"> </w:t>
+      </w:r>
+      <w:r>
+        <w:rPr>
+          <w:rStyle w:val="VerbatimChar"/>
+        </w:rPr>
+        <w:t xml:space="preserve">TAI-LIEU-PHAT-TAY.md</w:t>
+      </w:r>
+      <w:r>
+        <w:t xml:space="preserve">.</w:t>
+      </w:r>
+      <w:r>
+        <w:t xml:space="preserve"> </w:t>
+      </w:r>
+      <w:r>
+        <w:t xml:space="preserve">- ✅ Lặp ý: Slide 15 không nhắc lại kết quả dữ liệu thật (đã ở Slide 9); ví dụ AI chọn sai phương pháp đặt ở Slide 15.</w:t>
+      </w:r>
+      <w:r>
+        <w:t xml:space="preserve"> </w:t>
+      </w:r>
+      <w:r>
+        <w:t xml:space="preserve">- ✅ Thảo luận 15′ (Slide 3, 7, 8, 13, 14, 15 mỗi slide −1′).</w:t>
+      </w:r>
+      <w:r>
+        <w:t xml:space="preserve"> </w:t>
+      </w:r>
+      <w:r>
+        <w:t xml:space="preserve">- ✅ Rủi ro chất vấn: Slide 16 ghi</w:t>
+      </w:r>
+      <w:r>
+        <w:t xml:space="preserve"> </w:t>
+      </w:r>
+      <w:r>
+        <w:t xml:space="preserve">“</w:t>
+      </w:r>
+      <w:r>
+        <w:t xml:space="preserve">chuyên gia hiệu chỉnh</w:t>
+      </w:r>
+      <w:r>
+        <w:t xml:space="preserve">”</w:t>
+      </w:r>
+      <w:r>
+        <w:t xml:space="preserve">; Slide 19 ghi</w:t>
+      </w:r>
+      <w:r>
+        <w:t xml:space="preserve"> </w:t>
+      </w:r>
+      <w:r>
+        <w:t xml:space="preserve">“</w:t>
+      </w:r>
+      <w:r>
+        <w:t xml:space="preserve">trọng tâm là quy trình</w:t>
+      </w:r>
+      <w:r>
+        <w:t xml:space="preserve">”</w:t>
+      </w:r>
+      <w:r>
+        <w:t xml:space="preserve">.</w:t>
+      </w:r>
+      <w:r>
+        <w:t xml:space="preserve"> </w:t>
+      </w:r>
+      <w:r>
+        <w:t xml:space="preserve">- ✅ Câu hỏi về quy định, chi phí: Phụ lục E (câu hỏi thường gặp) –</w:t>
+      </w:r>
+      <w:r>
+        <w:t xml:space="preserve"> </w:t>
+      </w:r>
+      <w:r>
+        <w:rPr>
+          <w:bCs/>
+          <w:b/>
+        </w:rPr>
+        <w:t xml:space="preserve">còn 2 ô [CẦN ĐIỀN]</w:t>
+      </w:r>
+      <w:r>
+        <w:t xml:space="preserve">.</w:t>
+      </w:r>
+      <w:r>
+        <w:t xml:space="preserve"> </w:t>
+      </w:r>
+      <w:r>
+        <w:t xml:space="preserve">- ✅ Danh sách việc trước buổi thuyết trình: mục</w:t>
+      </w:r>
+      <w:r>
+        <w:t xml:space="preserve"> </w:t>
+      </w:r>
+      <w:r>
+        <w:t xml:space="preserve">“</w:t>
+      </w:r>
+      <w:r>
+        <w:t xml:space="preserve">Chuẩn bị</w:t>
+      </w:r>
+      <w:r>
+        <w:t xml:space="preserve">”</w:t>
+      </w:r>
+      <w:r>
+        <w:t xml:space="preserve"> </w:t>
+      </w:r>
+      <w:r>
+        <w:t xml:space="preserve">đầu</w:t>
+      </w:r>
+      <w:r>
+        <w:t xml:space="preserve"> </w:t>
+      </w:r>
+      <w:r>
+        <w:rPr>
+          <w:rStyle w:val="VerbatimChar"/>
+        </w:rPr>
+        <w:t xml:space="preserve">DANH-SACH-SLIDE.md</w:t>
+      </w:r>
+      <w:r>
+        <w:t xml:space="preserve">.</w:t>
+      </w:r>
+      <w:r>
+        <w:t xml:space="preserve"> </w:t>
+      </w:r>
+      <w:r>
+        <w:t xml:space="preserve">- ☐ Căn cứ còn mở (mục 3.4) – người trình bày xác nhận.</w:t>
       </w:r>
     </w:p>
     <w:p>

</xml_diff>

<commit_message>
Điều chỉnh slide theo đánh giá phản biện; demo chạy trước, chỉ trình chiếu (#8)
- Demo chạy trước, trình chiếu video – ảnh; mô hình 3D mở được không cần Internet (plotly.min.js cục bộ)
- Giảm chữ Slide 3, 7, 12, 20; chi tiết chuyển sang TAI-LIEU-PHAT-TAY.md
- Thảo luận 15′; mục Chuẩn bị trước buổi thuyết trình; Phụ lục E câu hỏi thường gặp


Claude-Session: https://claude.ai/code/session_01JoSsghLRHTtvcNzYXbKpzE

Co-authored-by: Claude <noreply@anthropic.com>
</commit_message>
<xml_diff>
--- a/thuyet-trinh/DANH-GIA-REVIEWER.docx
+++ b/thuyet-trinh/DANH-GIA-REVIEWER.docx
@@ -9,6 +9,151 @@
       </w:pPr>
       <w:r>
         <w:t xml:space="preserve">ĐÁNH GIÁ BÀI THUYẾT TRÌNH – GÓC NHÌN NGƯỜI PHẢN BIỆN</w:t>
+      </w:r>
+    </w:p>
+    <w:p>
+      <w:pPr>
+        <w:pStyle w:val="BlockText"/>
+      </w:pPr>
+      <w:r>
+        <w:rPr>
+          <w:bCs/>
+          <w:b/>
+        </w:rPr>
+        <w:t xml:space="preserve">Trạng thái xử lý (21/10/2026):</w:t>
+      </w:r>
+      <w:r>
+        <w:t xml:space="preserve"> </w:t>
+      </w:r>
+      <w:r>
+        <w:t xml:space="preserve">- ✅ Demo: chạy trước, chỉ trình chiếu video – ảnh (Slide 8, 13, 14, 15, 16, 19); mô hình 3D mở được không cần Internet.</w:t>
+      </w:r>
+      <w:r>
+        <w:t xml:space="preserve"> </w:t>
+      </w:r>
+      <w:r>
+        <w:t xml:space="preserve">- ✅ Giảm chữ: Slide 3 (bỏ bảng chatbot – Agent, bảng tính năng còn 4 dòng), Slide 7 (mô hình 1 dòng, tính năng còn 5), Slide 12 (bỏ bảng 8 tài liệu), Slide 20 (3 số lớn) – chi tiết chuyển sang</w:t>
+      </w:r>
+      <w:r>
+        <w:t xml:space="preserve"> </w:t>
+      </w:r>
+      <w:r>
+        <w:rPr>
+          <w:rStyle w:val="VerbatimChar"/>
+        </w:rPr>
+        <w:t xml:space="preserve">TAI-LIEU-PHAT-TAY.md</w:t>
+      </w:r>
+      <w:r>
+        <w:t xml:space="preserve">.</w:t>
+      </w:r>
+      <w:r>
+        <w:t xml:space="preserve"> </w:t>
+      </w:r>
+      <w:r>
+        <w:t xml:space="preserve">- ✅ Lặp ý: Slide 15 không nhắc lại kết quả dữ liệu thật (đã ở Slide 9); ví dụ AI chọn sai phương pháp đặt ở Slide 15.</w:t>
+      </w:r>
+      <w:r>
+        <w:t xml:space="preserve"> </w:t>
+      </w:r>
+      <w:r>
+        <w:t xml:space="preserve">- ✅ Thảo luận 15′ (Slide 3, 7, 8, 13, 14, 15 mỗi slide −1′).</w:t>
+      </w:r>
+      <w:r>
+        <w:t xml:space="preserve"> </w:t>
+      </w:r>
+      <w:r>
+        <w:t xml:space="preserve">- ✅ Rủi ro chất vấn: Slide 16 ghi</w:t>
+      </w:r>
+      <w:r>
+        <w:t xml:space="preserve"> </w:t>
+      </w:r>
+      <w:r>
+        <w:t xml:space="preserve">“</w:t>
+      </w:r>
+      <w:r>
+        <w:t xml:space="preserve">chuyên gia hiệu chỉnh</w:t>
+      </w:r>
+      <w:r>
+        <w:t xml:space="preserve">”</w:t>
+      </w:r>
+      <w:r>
+        <w:t xml:space="preserve">; Slide 19 ghi</w:t>
+      </w:r>
+      <w:r>
+        <w:t xml:space="preserve"> </w:t>
+      </w:r>
+      <w:r>
+        <w:t xml:space="preserve">“</w:t>
+      </w:r>
+      <w:r>
+        <w:t xml:space="preserve">trọng tâm là quy trình</w:t>
+      </w:r>
+      <w:r>
+        <w:t xml:space="preserve">”</w:t>
+      </w:r>
+      <w:r>
+        <w:t xml:space="preserve">.</w:t>
+      </w:r>
+      <w:r>
+        <w:t xml:space="preserve"> </w:t>
+      </w:r>
+      <w:r>
+        <w:t xml:space="preserve">- ✅ Câu hỏi về quy định, chi phí: Phụ lục E (câu hỏi thường gặp) –</w:t>
+      </w:r>
+      <w:r>
+        <w:t xml:space="preserve"> </w:t>
+      </w:r>
+      <w:r>
+        <w:rPr>
+          <w:bCs/>
+          <w:b/>
+        </w:rPr>
+        <w:t xml:space="preserve">còn 2 ô [CẦN ĐIỀN]</w:t>
+      </w:r>
+      <w:r>
+        <w:t xml:space="preserve">.</w:t>
+      </w:r>
+      <w:r>
+        <w:t xml:space="preserve"> </w:t>
+      </w:r>
+      <w:r>
+        <w:t xml:space="preserve">- ✅ Danh sách việc trước buổi thuyết trình: mục</w:t>
+      </w:r>
+      <w:r>
+        <w:t xml:space="preserve"> </w:t>
+      </w:r>
+      <w:r>
+        <w:t xml:space="preserve">“</w:t>
+      </w:r>
+      <w:r>
+        <w:t xml:space="preserve">Chuẩn bị</w:t>
+      </w:r>
+      <w:r>
+        <w:t xml:space="preserve">”</w:t>
+      </w:r>
+      <w:r>
+        <w:t xml:space="preserve"> </w:t>
+      </w:r>
+      <w:r>
+        <w:t xml:space="preserve">đầu</w:t>
+      </w:r>
+      <w:r>
+        <w:t xml:space="preserve"> </w:t>
+      </w:r>
+      <w:r>
+        <w:rPr>
+          <w:rStyle w:val="VerbatimChar"/>
+        </w:rPr>
+        <w:t xml:space="preserve">DANH-SACH-SLIDE.md</w:t>
+      </w:r>
+      <w:r>
+        <w:t xml:space="preserve">.</w:t>
+      </w:r>
+      <w:r>
+        <w:t xml:space="preserve"> </w:t>
+      </w:r>
+      <w:r>
+        <w:t xml:space="preserve">- ☐ Căn cứ còn mở (mục 3.4) – người trình bày xác nhận.</w:t>
       </w:r>
     </w:p>
     <w:p>

</xml_diff>

<commit_message>
Thêm Slide 7: công cụ tìm và đọc tài liệu (Sci-Hub, Sci-Bot và lựa chọn hợp pháp)
- Slide 7 mới sau slide công cụ AI, trước slide Claude; đánh số lại từ slide 7 cũ
- Tài liệu phát tay mục 11: 14 công cụ, cách dùng, lưu ý pháp lý; căn cứ N33–N37
- Thảo luận 12′, Slide 6 còn 3′

Co-Authored-By: Claude Opus 5.5 <noreply@anthropic.com>
Claude-Session: https://claude.ai/code/session_01JoSsghLRHTtvcNzYXbKpzE
</commit_message>
<xml_diff>
--- a/thuyet-trinh/DANH-GIA-REVIEWER.docx
+++ b/thuyet-trinh/DANH-GIA-REVIEWER.docx
@@ -9,6 +9,48 @@
       </w:pPr>
       <w:r>
         <w:t xml:space="preserve">ĐÁNH GIÁ BÀI THUYẾT TRÌNH – GÓC NHÌN NGƯỜI PHẢN BIỆN</w:t>
+      </w:r>
+    </w:p>
+    <w:p>
+      <w:pPr>
+        <w:pStyle w:val="BlockText"/>
+      </w:pPr>
+      <w:r>
+        <w:rPr>
+          <w:iCs/>
+          <w:i/>
+        </w:rPr>
+        <w:t xml:space="preserve">Số slide trong bản đánh giá này theo bố cục</w:t>
+      </w:r>
+      <w:r>
+        <w:rPr>
+          <w:iCs/>
+          <w:i/>
+        </w:rPr>
+        <w:t xml:space="preserve"> </w:t>
+      </w:r>
+      <w:r>
+        <w:rPr>
+          <w:bCs/>
+          <w:b/>
+          <w:iCs/>
+          <w:i/>
+        </w:rPr>
+        <w:t xml:space="preserve">trước khi thêm Slide 7</w:t>
+      </w:r>
+      <w:r>
+        <w:rPr>
+          <w:iCs/>
+          <w:i/>
+        </w:rPr>
+        <w:t xml:space="preserve"> </w:t>
+      </w:r>
+      <w:r>
+        <w:rPr>
+          <w:iCs/>
+          <w:i/>
+        </w:rPr>
+        <w:t xml:space="preserve">(công cụ tìm tài liệu) – từ Slide 7 trở đi, số slide hiện hành cộng 1.</w:t>
       </w:r>
     </w:p>
     <w:p>

</xml_diff>

<commit_message>
Thêm Slide 7: công cụ tìm và đọc tài liệu (Sci-Hub, Sci-Bot và lựa chọn hợp pháp) (#9)
- Slide 7 mới sau slide công cụ AI, trước slide Claude; đánh số lại từ slide 7 cũ
- Tài liệu phát tay mục 11: 14 công cụ, cách dùng, lưu ý pháp lý; căn cứ N33–N37
- Thảo luận 12′, Slide 6 còn 3′


Claude-Session: https://claude.ai/code/session_01JoSsghLRHTtvcNzYXbKpzE

Co-authored-by: Claude <noreply@anthropic.com>
</commit_message>
<xml_diff>
--- a/thuyet-trinh/DANH-GIA-REVIEWER.docx
+++ b/thuyet-trinh/DANH-GIA-REVIEWER.docx
@@ -9,6 +9,48 @@
       </w:pPr>
       <w:r>
         <w:t xml:space="preserve">ĐÁNH GIÁ BÀI THUYẾT TRÌNH – GÓC NHÌN NGƯỜI PHẢN BIỆN</w:t>
+      </w:r>
+    </w:p>
+    <w:p>
+      <w:pPr>
+        <w:pStyle w:val="BlockText"/>
+      </w:pPr>
+      <w:r>
+        <w:rPr>
+          <w:iCs/>
+          <w:i/>
+        </w:rPr>
+        <w:t xml:space="preserve">Số slide trong bản đánh giá này theo bố cục</w:t>
+      </w:r>
+      <w:r>
+        <w:rPr>
+          <w:iCs/>
+          <w:i/>
+        </w:rPr>
+        <w:t xml:space="preserve"> </w:t>
+      </w:r>
+      <w:r>
+        <w:rPr>
+          <w:bCs/>
+          <w:b/>
+          <w:iCs/>
+          <w:i/>
+        </w:rPr>
+        <w:t xml:space="preserve">trước khi thêm Slide 7</w:t>
+      </w:r>
+      <w:r>
+        <w:rPr>
+          <w:iCs/>
+          <w:i/>
+        </w:rPr>
+        <w:t xml:space="preserve"> </w:t>
+      </w:r>
+      <w:r>
+        <w:rPr>
+          <w:iCs/>
+          <w:i/>
+        </w:rPr>
+        <w:t xml:space="preserve">(công cụ tìm tài liệu) – từ Slide 7 trở đi, số slide hiện hành cộng 1.</w:t>
       </w:r>
     </w:p>
     <w:p>

</xml_diff>